<commit_message>
Fix: the previous commit's git add failed silently, committing stale content
The prior commit (5171ec99) intended to commit the edited GDD (v4.3
Version History entry, Implementation Notes after Sec 6.2/6.9, title
bump) plus a HANDOFF.md update, but the git add command included the
already-renamed-away old filename as a pathspec, which failed fatally
and silently skipped staging both real changes. The commit then
proceeded anyway, capturing the bare rename with no content update.
This actually stages the edited content.

Co-Authored-By: Claude Sonnet 5 <noreply@anthropic.com>
</commit_message>
<xml_diff>
--- a/docs/gdd/Franchise_Football_GDD_v4.3.docx
+++ b/docs/gdd/Franchise_Football_GDD_v4.3.docx
@@ -29,15 +29,15 @@
           <w:b/>
           <w:bCs/>
         </w:rPr>
-        <w:t xml:space="preserve">Version: v4.2 (Unified Edition)</w:t>
-      </w:r>
-    </w:p>
-    <w:p>
-      <w:pPr>
-        <w:spacing w:after="120"/>
-      </w:pPr>
-      <w:r>
-        <w:t xml:space="preserve">Date: September 6, 2026</w:t>
+        <w:t>Version: v4.3 (Unified Edition)</w:t>
+      </w:r>
+    </w:p>
+    <w:p>
+      <w:pPr>
+        <w:spacing w:after="120"/>
+      </w:pPr>
+      <w:r>
+        <w:t>Date: September 7, 2026</w:t>
       </w:r>
     </w:p>
     <w:p>
@@ -356,6 +356,11 @@
       </w:r>
       <w:r>
         <w:t xml:space="preserve">Updated §3.1's Player entity to match a real implementation: a full-league roster (2,365 players, Madden-derived, local-use-only project so real names are used as-is) was imported behind a much richer Player model than the old placeholder list — roughly 50 attributes across physical/passing/receiving/ball-carrier/blocking/defense/special-teams categories, using a granular side-specific position scheme (LT/LG/C/RG/RT, LE/RE/DT, LOLB/MLB/ROLB, CB/FS/SS) instead of generic OL/DL/LB/DB groups, because §6.6.2's zone-based blocking-advantage formula needs exactly that granularity to be implementable. This was a deliberate prerequisite decision: the GDD's play-calling AI (§6.6) is specified entirely in player-level terms, so building the real AI means having real player data first, not a team-level stand-in. Also landed the first non-Gaussian version of the Drive Engine (§6): an actual down-by-down play sequence (down/distance/field position, run/pass decisions, 4th-down go/kick/punt, safeties) using team-level inputs as an interim step, since player-level formulas aren't wired up to the engine yet. Three real bugs were found and fixed by actually running the engine rather than reading it: distance-to-go wasn't increasing on a loss, a play's outcome was silently overwritten, and play events were logging the down/distance/position after a play instead of what it was actually run under.</w:t>
+      </w:r>
+    </w:p>
+    <w:p>
+      <w:r>
+        <w:t>v4.3 -- Implementation-driven update after a real engineering session. Score Fidelity System (Sec 6.2) and Team Power Rating (Sec 7.2) built for real, adapted to the existing player-attribute-driven engine rather than GDD-literal -- see the Implementation Note after Sec 6.2 for the full list of what was and wasn't built. Penalty System (Sec 6.9) built for real as a 7-type subset of the full catalog -- see the Implementation Note after Sec 6.9. Also fixed a real cross-restart determinism bug (RNG seeding via Python's builtin hash() on strings, randomized per-process by default, replaced with a stable BLAKE2b-based seed) and wired up a real kicker for field goals and PATs (Sec 3.1's Player entity already had the attributes; OffensiveStarters just never selected one).</w:t>
       </w:r>
     </w:p>
     <w:p>
@@ -2772,6 +2777,24 @@
     MIX_u = MIX - K_mix ⊙ δmix
     // Clamp weekly deltas to caps; apply EMA damping α≈0.35
     persist multipliers for next week; write telemetry artifacts</w:t>
+      </w:r>
+    </w:p>
+    <w:p>
+      <w:r>
+        <w:rPr>
+          <w:b/>
+        </w:rPr>
+        <w:t>Implementation Note (v4.3, 2026-09-07)</w:t>
+      </w:r>
+    </w:p>
+    <w:p>
+      <w:r>
+        <w:t>Built for real in app/engine/power_rating.py and app/engine/score_fidelity.py, but adapted rather than GDD-literal: the Drive Engine already derives outcomes bottom-up from real player attributes (Sec 6.6), the opposite of this section's assumed top-down architecture of converting an EP target into an abstracted per-drive TD/FG/Punt/TO probability table. Replacing the player-level engine with such a table would have undone the Player-Level and Defensive Play-Calling AI work (Sec 6.6). Instead, EP anchoring is layered on as a small, bounded per-game scoring multiplier (MatchupContext.ep_multiplier) read by the pass/run outcome pipelines (Sec 6.6.6-6.6.7) to nudge completion odds and yardage.</w:t>
+      </w:r>
+    </w:p>
+    <w:p>
+      <w:r>
+        <w:t>Built faithfully: Team Power Rating (Sec 7.2, Elo/MOV/zero-sum), pre-game win probability and the parity/upset model (Sec 6.2.1-6.2.2), and a weekly feedback loop with the EMA damping this section specifies (alpha=0.35), closing on season/rolling PPG error -- the strictest, most measurable target in Sec 6.2.4. Deliberately NOT built: true per-quarter EP/Dirichlet quarter-share tracking (the engine has no quarter/clock model; approximated with one per-game noise draw), the Red Zone Module, the endgame PAT-decision model, and the weekly feedback loop's GSM/PN/QBM/MIX multipliers beyond the PPG term (that pseudocode references undefined symbols with no formulas given in this document). No formal tolerance-enforcement harness exists; verified empirically instead. A full 272-game season re-measurement landed season-end scoring at 22.6 PPG/team (within this section's own +/-0.7 tolerance) and Power Ratings spreading realistically across teams. Full detail: HANDOFF.md item 19 in the repo. NOTE: docs/gdd/score-fidelity-system.md, sitting alongside this document, describes a different, unmerged SFS design from an earlier (v2.17.3) branch of this GDD's synthesis -- an offline preseason calibration loop against real-NFL-derived targets, plus a strictly-guardrailed per-game outcome nudger. That design was NOT used here; it's a genuinely different paradigm (offline convergence vs. this section's online per-game/weekly correction) worth considering if the scope cuts above ever need revisiting.</w:t>
       </w:r>
     </w:p>
     <w:p>
@@ -6031,6 +6054,19 @@
       </w:r>
       <w:r>
         <w:t xml:space="preserve">The AI makes a simple, logical choice to accept or decline based on which outcome is more favorable.</w:t>
+      </w:r>
+    </w:p>
+    <w:p>
+      <w:r>
+        <w:rPr>
+          <w:b/>
+        </w:rPr>
+        <w:t>Implementation Note (v4.3, 2026-09-07)</w:t>
+      </w:r>
+    </w:p>
+    <w:p>
+      <w:r>
+        <w:t>Built for real in app/engine/drive_sim.py (see its PenaltyOutcome section) as a deliberate subset: 7 types (False Start, Delay of Game, Illegal Formation, Offside, Offensive Holding, Defensive Pass Interference, Roughing the Passer), not this section's full dozen-plus catalog. Real attribution (to an actual OL/DL/secondary/blitzer player, not a placeholder) and real accept/decline for the two in-play types where it's tractable (Offensive Holding: the defense only accepts if enforcing the penalty leaves the offense worse off than the real play already did; DPI and Roughing the Passer: always accepted, since the alternative is strictly better for the offense). No Team_Discipline_Modifier or Coach_Modifier in Step 1's probability -- neither a per-player Discipline rating nor a Coach entity exists in the real (Madden-derived) roster data this project imports, so type probabilities are flat, tunable constants instead. Touchdowns, turnovers, and safeties are scoped out of in-play penalty consideration entirely -- real accept/decline gets genuinely complicated there (e.g. a defense can decline a holding call to let an interception return stand). Full detail: HANDOFF.md item 18 in the repo.</w:t>
       </w:r>
     </w:p>
     <w:p>

</xml_diff>